<commit_message>
submission: refresh cover letter, title page, and docx for the corrected results
Cover letter: 68% of 127 providers -> 59% of 99; the reverse-order claim
replaced with what the scorecard actually shows (containment ranked highest
the forecast the interval score ranked last); word counts 1,518/299 ->
1,960/294. Adds one sentence on the parameter-availability audit, since a
strictly out-of-time forecast is part of what the paper is claiming.

Title page: word counts, and the supplement is now 11 appendices rather
than 7 tables.

All four docx rebuilt from the current markdown.

Co-Authored-By: Claude Opus 5 (1M context) <noreply@anthropic.com>
</commit_message>
<xml_diff>
--- a/docs/submission/COVER_LETTER.docx
+++ b/docs/submission/COVER_LETTER.docx
@@ -48,14 +48,9 @@
       <w:r>
         <w:t xml:space="preserve"> </w:t>
       </w:r>
-      <w:hyperlink r:id="rId9">
-        <w:r>
-          <w:rPr>
-            <w:rStyle w:val="Hyperlink"/>
-          </w:rPr>
-          <w:t xml:space="preserve">tyler.muffly@dhha.org</w:t>
-        </w:r>
-      </w:hyperlink>
+      <w:r>
+        <w:t xml:space="preserve">tyler.muffly@dhha.org</w:t>
+      </w:r>
     </w:p>
     <w:p>
       <w:pPr>
@@ -96,7 +91,13 @@
         <w:pStyle w:val="BodyText"/>
       </w:pPr>
       <w:r>
-        <w:t xml:space="preserve">Please consider the enclosed manuscript, "Historical Validation of National</w:t>
+        <w:t xml:space="preserve">Please consider the enclosed manuscript,</w:t>
+      </w:r>
+      <w:r>
+        <w:t xml:space="preserve"> </w:t>
+      </w:r>
+      <w:r>
+        <w:t xml:space="preserve">“Historical Validation of National</w:t>
       </w:r>
       <w:r>
         <w:t xml:space="preserve"> </w:t>
@@ -108,7 +109,13 @@
         <w:t xml:space="preserve"> </w:t>
       </w:r>
       <w:r>
-        <w:t xml:space="preserve">the Workforce," for publication as Original Research.</w:t>
+        <w:t xml:space="preserve">the Workforce,”</w:t>
+      </w:r>
+      <w:r>
+        <w:t xml:space="preserve"> </w:t>
+      </w:r>
+      <w:r>
+        <w:t xml:space="preserve">for publication as Original Research.</w:t>
       </w:r>
     </w:p>
     <w:p>
@@ -178,13 +185,13 @@
         <w:t xml:space="preserve"> </w:t>
       </w:r>
       <w:r>
-        <w:t xml:space="preserve">does not, and the reason is the point of the paper. Sixty-eight percent of the</w:t>
-      </w:r>
-      <w:r>
-        <w:t xml:space="preserve"> </w:t>
-      </w:r>
-      <w:r>
-        <w:t xml:space="preserve">127-provider discrepancy arose not from assumptions about how urogynecologists</w:t>
+        <w:t xml:space="preserve">does not, and the reason is the point of the paper. Fifty-nine percent of the</w:t>
+      </w:r>
+      <w:r>
+        <w:t xml:space="preserve"> </w:t>
+      </w:r>
+      <w:r>
+        <w:t xml:space="preserve">99-provider discrepancy arose not from assumptions about how urogynecologists</w:t>
       </w:r>
       <w:r>
         <w:t xml:space="preserve"> </w:t>
@@ -246,19 +253,13 @@
         <w:t xml:space="preserve"> </w:t>
       </w:r>
       <w:r>
-        <w:t xml:space="preserve">ranked our candidate forecasts in exactly the reverse order of a proper scoring</w:t>
-      </w:r>
-      <w:r>
-        <w:t xml:space="preserve"> </w:t>
-      </w:r>
-      <w:r>
-        <w:t xml:space="preserve">rule, favoring a forecast whose interval was 1,466 providers wide with a lower</w:t>
-      </w:r>
-      <w:r>
-        <w:t xml:space="preserve"> </w:t>
-      </w:r>
-      <w:r>
-        <w:t xml:space="preserve">bound below zero. Third, apparent accuracy proved to depend heavily on</w:t>
+        <w:t xml:space="preserve">ranked highest the forecast that a proper scoring rule ranked last: one whose</w:t>
+      </w:r>
+      <w:r>
+        <w:t xml:space="preserve"> </w:t>
+      </w:r>
+      <w:r>
+        <w:t xml:space="preserve">interval was 1,466 providers wide with a lower bound below zero. Third, apparent accuracy proved to depend heavily on</w:t>
       </w:r>
       <w:r>
         <w:t xml:space="preserve"> </w:t>
@@ -328,7 +329,7 @@
         <w:pStyle w:val="BodyText"/>
       </w:pPr>
       <w:r>
-        <w:t xml:space="preserve">The manuscript is 1,518 words of main text with a 299-word structured abstract,</w:t>
+        <w:t xml:space="preserve">The manuscript is 1,960 words of main text with a 294-word structured abstract,</w:t>
       </w:r>
       <w:r>
         <w:t xml:space="preserve"> </w:t>
@@ -346,7 +347,25 @@
         <w:t xml:space="preserve"> </w:t>
       </w:r>
       <w:r>
-        <w:t xml:space="preserve">analyses are reproducible from committed code and artifacts.</w:t>
+        <w:t xml:space="preserve">analyses are reproducible from committed code and artifacts. Every model</w:t>
+      </w:r>
+      <w:r>
+        <w:t xml:space="preserve"> </w:t>
+      </w:r>
+      <w:r>
+        <w:t xml:space="preserve">parameter in the historical forecast was audited for availability at the 2020</w:t>
+      </w:r>
+      <w:r>
+        <w:t xml:space="preserve"> </w:t>
+      </w:r>
+      <w:r>
+        <w:t xml:space="preserve">origin; the one parameter that postdated it was removed from the primary</w:t>
+      </w:r>
+      <w:r>
+        <w:t xml:space="preserve"> </w:t>
+      </w:r>
+      <w:r>
+        <w:t xml:space="preserve">analysis and is reported only as a sensitivity analysis.</w:t>
       </w:r>
     </w:p>
     <w:p>

</xml_diff>